<commit_message>
Fix pack document footers and pagination; bump 02/03c/05 to v1.1; add /admin home
- Repair malformed PAGE/NUMPAGES field runs in footers (02, 03c, 05, draft+final):
  fields now render 'Page N of M' in Open Sans instead of italic serif with
  missing spaces
- Delivery script (03c): restamp v1.1 issued 1 September 2026; label all three
  Slide 12 version panels with 'Slide 12 ·' and break before the ROI panel so
  no version is orphaned without context; reduce the closing-page disclaimer to
  the policy cross-reference (footer already carries the disclaimer)
- Manager guidance (02) and contract clauses (05) finals restamped v1.1
- CURRENT_VERSIONS bumped to v1.1 for the three changed files (forces re-sign-off)
- notes.json issued lines updated; preview PDFs and page JPEGs regenerated
- New GET /admin home page (token-gated): Documents and Orders status cards
  linking to the sign-off and fulfilment screens; back-links added on both
</commit_message>
<xml_diff>
--- a/assets/fulfilment/final/nivha_pack_02_manager_guidance.docx
+++ b/assets/fulfilment/final/nivha_pack_02_manager_guidance.docx
@@ -1010,7 +1010,7 @@
         <w:sz w:val="14"/>
         <w:szCs w:val="14"/>
       </w:rPr>
-      <w:t xml:space="preserve">v1.0 — issued 1 September 2026 · prepared with NIVHA Laboratory Services · a template for the organisation to review and adopt — not legal advice.</w:t>
+      <w:t xml:space="preserve">v1.1 — issued 1 September 2026 · prepared with NIVHA Laboratory Services · a template for the organisation to review and adopt — not legal advice.</w:t>
     </w:r>
   </w:p>
   <w:p>
@@ -1034,8 +1034,41 @@
         <w:szCs w:val="14"/>
       </w:rPr>
       <w:fldChar w:fldCharType="begin"/>
-      <w:instrText xml:space="preserve">PAGE</w:instrText>
+    </w:r>
+    <w:r>
+      <w:rPr>
+        <w:rFonts w:ascii="Open Sans" w:cs="Open Sans" w:eastAsia="Open Sans" w:hAnsi="Open Sans"/>
+        <w:color w:val="63686C"/>
+        <w:sz w:val="14"/>
+        <w:szCs w:val="14"/>
+      </w:rPr>
+      <w:instrText xml:space="preserve"> PAGE </w:instrText>
+    </w:r>
+    <w:r>
+      <w:rPr>
+        <w:rFonts w:ascii="Open Sans" w:cs="Open Sans" w:eastAsia="Open Sans" w:hAnsi="Open Sans"/>
+        <w:color w:val="63686C"/>
+        <w:sz w:val="14"/>
+        <w:szCs w:val="14"/>
+      </w:rPr>
       <w:fldChar w:fldCharType="separate"/>
+    </w:r>
+    <w:r>
+      <w:rPr>
+        <w:rFonts w:ascii="Open Sans" w:cs="Open Sans" w:eastAsia="Open Sans" w:hAnsi="Open Sans"/>
+        <w:color w:val="63686C"/>
+        <w:sz w:val="14"/>
+        <w:szCs w:val="14"/>
+      </w:rPr>
+      <w:t>1</w:t>
+    </w:r>
+    <w:r>
+      <w:rPr>
+        <w:rFonts w:ascii="Open Sans" w:cs="Open Sans" w:eastAsia="Open Sans" w:hAnsi="Open Sans"/>
+        <w:color w:val="63686C"/>
+        <w:sz w:val="14"/>
+        <w:szCs w:val="14"/>
+      </w:rPr>
       <w:fldChar w:fldCharType="end"/>
     </w:r>
     <w:r>
@@ -1055,8 +1088,41 @@
         <w:szCs w:val="14"/>
       </w:rPr>
       <w:fldChar w:fldCharType="begin"/>
-      <w:instrText xml:space="preserve">NUMPAGES</w:instrText>
+    </w:r>
+    <w:r>
+      <w:rPr>
+        <w:rFonts w:ascii="Open Sans" w:cs="Open Sans" w:eastAsia="Open Sans" w:hAnsi="Open Sans"/>
+        <w:color w:val="63686C"/>
+        <w:sz w:val="14"/>
+        <w:szCs w:val="14"/>
+      </w:rPr>
+      <w:instrText xml:space="preserve"> NUMPAGES </w:instrText>
+    </w:r>
+    <w:r>
+      <w:rPr>
+        <w:rFonts w:ascii="Open Sans" w:cs="Open Sans" w:eastAsia="Open Sans" w:hAnsi="Open Sans"/>
+        <w:color w:val="63686C"/>
+        <w:sz w:val="14"/>
+        <w:szCs w:val="14"/>
+      </w:rPr>
       <w:fldChar w:fldCharType="separate"/>
+    </w:r>
+    <w:r>
+      <w:rPr>
+        <w:rFonts w:ascii="Open Sans" w:cs="Open Sans" w:eastAsia="Open Sans" w:hAnsi="Open Sans"/>
+        <w:color w:val="63686C"/>
+        <w:sz w:val="14"/>
+        <w:szCs w:val="14"/>
+      </w:rPr>
+      <w:t>1</w:t>
+    </w:r>
+    <w:r>
+      <w:rPr>
+        <w:rFonts w:ascii="Open Sans" w:cs="Open Sans" w:eastAsia="Open Sans" w:hAnsi="Open Sans"/>
+        <w:color w:val="63686C"/>
+        <w:sz w:val="14"/>
+        <w:szCs w:val="14"/>
+      </w:rPr>
       <w:fldChar w:fldCharType="end"/>
     </w:r>
   </w:p>

</xml_diff>